<commit_message>
Add detector ablation; document object detection as harmful on 4 of 5 clips
</commit_message>
<xml_diff>
--- a/docs/Final_Report.docx
+++ b/docs/Final_Report.docx
@@ -6633,6 +6633,18 @@
     </w:p>
     <w:p>
       <w:pPr>
+        <w:spacing w:after="140" w:line="276"/>
+      </w:pPr>
+      <w:r>
+        <w:rPr>
+          <w:sz w:val="22"/>
+          <w:szCs w:val="22"/>
+        </w:rPr>
+        <w:t>Two observations come from running the pipeline over 24 additional clips that have no ground truth. The first is robustness: all 24 completed without failure, and the segmentation rate on footage the system has never seen matches the development set closely — 5.42 seconds per segment across the 24, against 5.25 across the five annotated clips at the same configuration, a difference of three per cent, with a standard deviation of 2.2 segments per clip. Since these clips have no answer key the comparison is descriptive rather than an accuracy measurement, but the consistency of the rate is evidence that the method does not behave erratically on unfamiliar material. The second observation is a criticism of the metric used throughout this report. Counting predicted segments against annotated steps on the five labelled clips, the selected global configuration produces 72 segments against 40 human steps, a factor of 1.80. The configuration that preceded it produced 51, a factor of 1.27, yet scored lower on boundary F1. Boundary F1 with tolerance matching rewards proposing more boundaries: each additional prediction is another opportunity to fall within tolerance of a reference, and the precision penalty does not fully offset that gain. Grid search maximising F1 therefore drifts toward over-segmentation, and the configuration this report presents as optimal cuts the video roughly twice as finely as a human annotator would. For the stated objective — locating step boundaries — that is the right trade, since a missed boundary cannot be recovered downstream while a spurious one can be merged. For any application where the segment count itself matters it is the wrong trade, and a metric penalising over-segmentation directly, or a fixed segment budget, would be the better selection criterion.</w:t>
+      </w:r>
+    </w:p>
+    <w:p>
+      <w:pPr>
         <w:spacing w:after="40" w:before="120"/>
         <w:jc w:val="center"/>
       </w:pPr>
@@ -6786,6 +6798,30 @@
           <w:szCs w:val="22"/>
         </w:rPr>
         <w:t xml:space="preserve">Zero-shot open-vocabulary detection could not reliably recognise small assembly parts in this close-up, hand-occluded footage; at a confidence floor of 0.01 the strongest score for any real part across sixty frames was 0.024. Larger components were occasionally detected (the CPU as “processor”, and “header” and “motherboard” on the cable clip) but not consistently. As recognition is out of scope this does not affect the segmentation goal, but it shows that reliable component labelling would require a detector trained on the project's own footage.</w:t>
+      </w:r>
+    </w:p>
+    <w:p>
+      <w:pPr>
+        <w:spacing w:after="140" w:line="276"/>
+      </w:pPr>
+      <w:r>
+        <w:rPr>
+          <w:sz w:val="22"/>
+          <w:szCs w:val="22"/>
+        </w:rPr>
+        <w:t>A stronger version of this result emerged from watching the annotated output rather than reading tables. The detector does not merely fail to recognise parts; it fires on essentially everything. Across all five clips it reports at least one component in 100 per cent of frames, averaging 3.5 to 4.0 detections per frame, on footage where often only a hand and a bare work surface are visible, and its visible-object set changes on 13 to 26 per cent of frames. Since the boundary logic consumes changes in the detected object set rather than the class names, that churn is a source of spurious transitions. Disabling the detector entirely (--detector none) and re-running all five clips at the same global configuration improves F1 on four of the five: cable connection from 0.118 to 0.400, RAM from 0.296 to 0.370, CPU placement from 0.571 to 0.632, and the held-out clip from 0.583 to 0.636, with only the cooling-fan clip degrading, from 0.923 to 0.833. The development mean rises from 0.477 to 0.559 and the clean-clip leave-one-out mean from 0.684 to 0.769, while the pipeline runs 4.2 times faster at 7.1 frames per second against 1.7. Every remaining boundary on the cooling-fan clip is still correct — precision stays at 1.000 — so the detector's contribution there is one additional true boundary bought at more than four times the runtime.</w:t>
+      </w:r>
+    </w:p>
+    <w:p>
+      <w:pPr>
+        <w:spacing w:after="140" w:line="276"/>
+      </w:pPr>
+      <w:r>
+        <w:rPr>
+          <w:sz w:val="22"/>
+          <w:szCs w:val="22"/>
+        </w:rPr>
+        <w:t>That evidence is strong but deliberately not acted on in the headline configuration, and the reason is worth stating. Examined across the full threshold and minimum-duration grid, the held-out clip averages 0.427 with the detector enabled and 0.392 with it disabled: removing the detector raises the ceiling, from 0.600 to 0.636, but lowers the average, because the remaining cues are more sensitive to the configuration. Consequently a configuration selected honestly on the development clips with the detector disabled — threshold 0.60, minimum duration 3.5 s — scores 0.614 on those clips but only 0.471 on the held-out one, worse than the 0.583 obtained with the detector enabled. With four development clips and one held-out clip the two protocols disagree, and there is not enough data to decide between them. Restructuring the reported system on a mixed result from five clips would repeat precisely the error documented in Section 7.1, where an apparent improvement turned out to be an artefact of the evaluation rather than a property of the method. The finding is therefore reported as an ablation: on the available evidence, object detection is the weakest of the five feature extractors, is a plausible candidate for removal, and removing it should be revisited once the dataset is large enough for the comparison to be conclusive. Taken together with the scene-change result of Section 6.5, two of the five extractors now have measured evidence against them, and the components carrying the signal are optical flow and hand tracking.</w:t>
       </w:r>
     </w:p>
     <w:p>

</xml_diff>